<commit_message>
feat: add new def test
</commit_message>
<xml_diff>
--- a/Report.docx
+++ b/Report.docx
@@ -281,10 +281,7 @@
               <w:t>Учебный модуль</w:t>
             </w:r>
             <w:r>
-              <w:t xml:space="preserve"> </w:t>
-            </w:r>
-            <w:r>
-              <w:t xml:space="preserve">– </w:t>
+              <w:t xml:space="preserve"> – </w:t>
             </w:r>
             <w:r>
               <w:t>Delivery.py</w:t>
@@ -313,9 +310,18 @@
           <w:p>
             <w:pPr>
               <w:pStyle w:val="af"/>
-            </w:pPr>
-            <w:r>
-              <w:t>16</w:t>
+              <w:rPr>
+                <w:lang w:val="en-US"/>
+              </w:rPr>
+            </w:pPr>
+            <w:r>
+              <w:t>1</w:t>
+            </w:r>
+            <w:r>
+              <w:rPr>
+                <w:lang w:val="en-US"/>
+              </w:rPr>
+              <w:t>7</w:t>
             </w:r>
           </w:p>
         </w:tc>
@@ -327,9 +333,15 @@
           <w:p>
             <w:pPr>
               <w:pStyle w:val="af"/>
-            </w:pPr>
-            <w:r>
-              <w:t>14</w:t>
+              <w:rPr>
+                <w:lang w:val="en-US"/>
+              </w:rPr>
+            </w:pPr>
+            <w:r>
+              <w:t>1</w:t>
+            </w:r>
+            <w:r>
+              <w:t>4</w:t>
             </w:r>
           </w:p>
         </w:tc>
@@ -341,9 +353,15 @@
           <w:p>
             <w:pPr>
               <w:pStyle w:val="af"/>
-            </w:pPr>
-            <w:r>
-              <w:t>2</w:t>
+              <w:rPr>
+                <w:lang w:val="en-US"/>
+              </w:rPr>
+            </w:pPr>
+            <w:r>
+              <w:rPr>
+                <w:lang w:val="en-US"/>
+              </w:rPr>
+              <w:t>3</w:t>
             </w:r>
           </w:p>
         </w:tc>
@@ -382,9 +400,18 @@
           <w:p>
             <w:pPr>
               <w:pStyle w:val="af"/>
-            </w:pPr>
-            <w:r>
-              <w:t>26</w:t>
+              <w:rPr>
+                <w:lang w:val="en-US"/>
+              </w:rPr>
+            </w:pPr>
+            <w:r>
+              <w:t>2</w:t>
+            </w:r>
+            <w:r>
+              <w:rPr>
+                <w:lang w:val="en-US"/>
+              </w:rPr>
+              <w:t>7</w:t>
             </w:r>
           </w:p>
         </w:tc>
@@ -410,9 +437,15 @@
           <w:p>
             <w:pPr>
               <w:pStyle w:val="af"/>
-            </w:pPr>
-            <w:r>
-              <w:t>2</w:t>
+              <w:rPr>
+                <w:lang w:val="en-US"/>
+              </w:rPr>
+            </w:pPr>
+            <w:r>
+              <w:rPr>
+                <w:lang w:val="en-US"/>
+              </w:rPr>
+              <w:t>3</w:t>
             </w:r>
           </w:p>
         </w:tc>
@@ -477,39 +510,7 @@
           <w:bCs w:val="0"/>
           <w:lang w:val="en-US"/>
         </w:rPr>
-        <w:t xml:space="preserve"> python -m </w:t>
-      </w:r>
-      <w:proofErr w:type="spellStart"/>
-      <w:r>
-        <w:rPr>
-          <w:bCs w:val="0"/>
-          <w:lang w:val="en-US"/>
-        </w:rPr>
-        <w:t>unittest</w:t>
-      </w:r>
-      <w:proofErr w:type="spellEnd"/>
-      <w:r>
-        <w:rPr>
-          <w:bCs w:val="0"/>
-          <w:lang w:val="en-US"/>
-        </w:rPr>
-        <w:t xml:space="preserve"> </w:t>
-      </w:r>
-      <w:proofErr w:type="spellStart"/>
-      <w:r>
-        <w:rPr>
-          <w:bCs w:val="0"/>
-          <w:lang w:val="en-US"/>
-        </w:rPr>
-        <w:t>tests.test_delivery</w:t>
-      </w:r>
-      <w:proofErr w:type="spellEnd"/>
-      <w:r>
-        <w:rPr>
-          <w:bCs w:val="0"/>
-          <w:lang w:val="en-US"/>
-        </w:rPr>
-        <w:t xml:space="preserve"> -v:</w:t>
+        <w:t xml:space="preserve"> python -m unittest tests.test_delivery -v:</w:t>
       </w:r>
     </w:p>
     <w:p>
@@ -548,7 +549,14 @@
           <w:bCs w:val="0"/>
           <w:lang w:val="en-US"/>
         </w:rPr>
-        <w:t>: 16</w:t>
+        <w:t>: 1</w:t>
+      </w:r>
+      <w:r>
+        <w:rPr>
+          <w:bCs w:val="0"/>
+          <w:lang w:val="en-US"/>
+        </w:rPr>
+        <w:t>7</w:t>
       </w:r>
     </w:p>
     <w:p>
@@ -587,14 +595,14 @@
           <w:bCs w:val="0"/>
           <w:lang w:val="en-US"/>
         </w:rPr>
-        <w:t>: 2</w:t>
+        <w:t xml:space="preserve">: </w:t>
       </w:r>
       <w:r>
         <w:rPr>
           <w:bCs w:val="0"/>
           <w:lang w:val="en-US"/>
         </w:rPr>
-        <w:t xml:space="preserve"> </w:t>
+        <w:t>3</w:t>
       </w:r>
     </w:p>
     <w:p>
@@ -750,14 +758,12 @@
                 <w:lang w:val="en-US"/>
               </w:rPr>
             </w:pPr>
-            <w:proofErr w:type="spellStart"/>
             <w:r>
               <w:rPr>
                 <w:lang w:val="en-US"/>
               </w:rPr>
               <w:t>test_express_should_cost_more</w:t>
             </w:r>
-            <w:proofErr w:type="spellEnd"/>
           </w:p>
         </w:tc>
         <w:tc>
@@ -798,15 +804,7 @@
               <w:pStyle w:val="af"/>
             </w:pPr>
             <w:r>
-              <w:t xml:space="preserve">Заменить коэффициент на повышающий, например: </w:t>
-            </w:r>
-            <w:proofErr w:type="spellStart"/>
-            <w:r>
-              <w:t>total_cost</w:t>
-            </w:r>
-            <w:proofErr w:type="spellEnd"/>
-            <w:r>
-              <w:t xml:space="preserve"> *= 2.0</w:t>
+              <w:t>Заменить коэффициент на повышающий, например: total_cost *= 2.0</w:t>
             </w:r>
           </w:p>
         </w:tc>
@@ -838,14 +836,12 @@
                 <w:lang w:val="en-US"/>
               </w:rPr>
             </w:pPr>
-            <w:proofErr w:type="spellStart"/>
             <w:r>
               <w:rPr>
                 <w:lang w:val="en-US"/>
               </w:rPr>
               <w:t>test_cost_rounded_not_truncated</w:t>
             </w:r>
-            <w:proofErr w:type="spellEnd"/>
           </w:p>
         </w:tc>
         <w:tc>
@@ -872,20 +868,7 @@
               <w:pStyle w:val="af"/>
             </w:pPr>
             <w:r>
-              <w:t xml:space="preserve">Функция </w:t>
-            </w:r>
-            <w:proofErr w:type="spellStart"/>
-            <w:proofErr w:type="gramStart"/>
-            <w:r>
-              <w:t>int</w:t>
-            </w:r>
-            <w:proofErr w:type="spellEnd"/>
-            <w:r>
-              <w:t>(</w:t>
-            </w:r>
-            <w:proofErr w:type="gramEnd"/>
-            <w:r>
-              <w:t>) отбрасывает дробную часть, а не округляет по правилам арифметики. Например, при стоимости 1057.5 руб. клиент увидит 1057 вместо 1058. Это приводит к систематическому занижению итоговой суммы в пользу клиента и расхождению с бухгалтерскими расчётами.</w:t>
+              <w:t>Функция int() отбрасывает дробную часть, а не округляет по правилам арифметики. Например, при стоимости 1057.5 руб. клиент увидит 1057 вместо 1058. Это приводит к систематическому занижению итоговой суммы в пользу клиента и расхождению с бухгалтерскими расчётами.</w:t>
             </w:r>
           </w:p>
         </w:tc>
@@ -908,16 +891,191 @@
               <w:rPr>
                 <w:lang w:val="en-US"/>
               </w:rPr>
-              <w:t xml:space="preserve"> int(</w:t>
-            </w:r>
-            <w:proofErr w:type="spellStart"/>
-            <w:r>
-              <w:rPr>
-                <w:lang w:val="en-US"/>
-              </w:rPr>
-              <w:t>total_cost</w:t>
-            </w:r>
-            <w:proofErr w:type="spellEnd"/>
+              <w:t xml:space="preserve"> int(total_cost) </w:t>
+            </w:r>
+            <w:r>
+              <w:t>на</w:t>
+            </w:r>
+            <w:r>
+              <w:rPr>
+                <w:lang w:val="en-US"/>
+              </w:rPr>
+              <w:t xml:space="preserve"> round(total_cost)</w:t>
+            </w:r>
+          </w:p>
+        </w:tc>
+      </w:tr>
+      <w:tr>
+        <w:tc>
+          <w:tcPr>
+            <w:tcW w:w="412" w:type="dxa"/>
+          </w:tcPr>
+          <w:p>
+            <w:pPr>
+              <w:pStyle w:val="af"/>
+              <w:rPr>
+                <w:lang w:val="en-US"/>
+              </w:rPr>
+            </w:pPr>
+            <w:r>
+              <w:rPr>
+                <w:lang w:val="en-US"/>
+              </w:rPr>
+              <w:t>3</w:t>
+            </w:r>
+          </w:p>
+        </w:tc>
+        <w:tc>
+          <w:tcPr>
+            <w:tcW w:w="1851" w:type="dxa"/>
+          </w:tcPr>
+          <w:p>
+            <w:pPr>
+              <w:pStyle w:val="af"/>
+              <w:rPr>
+                <w:lang w:val="en-US"/>
+              </w:rPr>
+            </w:pPr>
+            <w:r>
+              <w:t>test_0_day</w:t>
+            </w:r>
+          </w:p>
+        </w:tc>
+        <w:tc>
+          <w:tcPr>
+            <w:tcW w:w="1418" w:type="dxa"/>
+          </w:tcPr>
+          <w:p>
+            <w:pPr>
+              <w:pStyle w:val="af"/>
+              <w:rPr>
+                <w:lang w:val="en-US"/>
+              </w:rPr>
+            </w:pPr>
+            <w:r>
+              <w:rPr>
+                <w:lang w:val="en-US"/>
+              </w:rPr>
+              <w:t>44</w:t>
+            </w:r>
+          </w:p>
+        </w:tc>
+        <w:tc>
+          <w:tcPr>
+            <w:tcW w:w="4033" w:type="dxa"/>
+          </w:tcPr>
+          <w:p>
+            <w:pPr>
+              <w:pStyle w:val="af"/>
+            </w:pPr>
+            <w:r>
+              <w:t>При</w:t>
+            </w:r>
+            <w:r>
+              <w:t xml:space="preserve"> </w:t>
+            </w:r>
+            <w:r>
+              <w:rPr>
+                <w:lang w:val="en-US"/>
+              </w:rPr>
+              <w:t>is</w:t>
+            </w:r>
+            <w:r>
+              <w:t>_</w:t>
+            </w:r>
+            <w:r>
+              <w:rPr>
+                <w:lang w:val="en-US"/>
+              </w:rPr>
+              <w:t>express</w:t>
+            </w:r>
+            <w:r>
+              <w:t xml:space="preserve"> = </w:t>
+            </w:r>
+            <w:r>
+              <w:rPr>
+                <w:lang w:val="en-US"/>
+              </w:rPr>
+              <w:t>True</w:t>
+            </w:r>
+            <w:r>
+              <w:t xml:space="preserve"> </w:t>
+            </w:r>
+            <w:r>
+              <w:t>и</w:t>
+            </w:r>
+            <w:r>
+              <w:t xml:space="preserve"> </w:t>
+            </w:r>
+            <w:r>
+              <w:t>доставке</w:t>
+            </w:r>
+            <w:r>
+              <w:t xml:space="preserve">, </w:t>
+            </w:r>
+            <w:r>
+              <w:t>занимающей один день, доставка начинает занимать не 1 день, а 0, так как при делении дробная часть отбрасывается, а не округляется.</w:t>
+            </w:r>
+          </w:p>
+        </w:tc>
+        <w:tc>
+          <w:tcPr>
+            <w:tcW w:w="1631" w:type="dxa"/>
+          </w:tcPr>
+          <w:p>
+            <w:pPr>
+              <w:pStyle w:val="af"/>
+              <w:rPr>
+                <w:lang w:val="en-US"/>
+              </w:rPr>
+            </w:pPr>
+            <w:r>
+              <w:t>Заменить</w:t>
+            </w:r>
+            <w:r>
+              <w:rPr>
+                <w:lang w:val="en-US"/>
+              </w:rPr>
+              <w:t xml:space="preserve"> </w:t>
+            </w:r>
+            <w:r>
+              <w:rPr>
+                <w:lang w:val="en-US"/>
+              </w:rPr>
+              <w:t>days_needed // 2</w:t>
+            </w:r>
+            <w:r>
+              <w:rPr>
+                <w:lang w:val="en-US"/>
+              </w:rPr>
+              <w:t xml:space="preserve"> </w:t>
+            </w:r>
+            <w:r>
+              <w:t>на</w:t>
+            </w:r>
+            <w:r>
+              <w:rPr>
+                <w:lang w:val="en-US"/>
+              </w:rPr>
+              <w:t xml:space="preserve"> </w:t>
+            </w:r>
+            <w:r>
+              <w:rPr>
+                <w:lang w:val="en-US"/>
+              </w:rPr>
+              <w:t>round(</w:t>
+            </w:r>
+            <w:r>
+              <w:rPr>
+                <w:lang w:val="en-US"/>
+              </w:rPr>
+              <w:t>days_needed // 2</w:t>
+            </w:r>
+          </w:p>
+          <w:p>
+            <w:pPr>
+              <w:pStyle w:val="af"/>
+            </w:pPr>
             <w:r>
               <w:rPr>
                 <w:lang w:val="en-US"/>
@@ -925,22 +1083,17 @@
               <w:t xml:space="preserve">) </w:t>
             </w:r>
             <w:r>
-              <w:t>на</w:t>
-            </w:r>
-            <w:r>
-              <w:rPr>
-                <w:lang w:val="en-US"/>
-              </w:rPr>
-              <w:t xml:space="preserve"> round(</w:t>
-            </w:r>
-            <w:proofErr w:type="spellStart"/>
-            <w:r>
-              <w:rPr>
-                <w:lang w:val="en-US"/>
-              </w:rPr>
-              <w:t>total_cost</w:t>
-            </w:r>
-            <w:proofErr w:type="spellEnd"/>
+              <w:t xml:space="preserve">или </w:t>
+            </w:r>
+            <w:r>
+              <w:rPr>
+                <w:lang w:val="en-US"/>
+              </w:rPr>
+              <w:t xml:space="preserve">max(1, </w:t>
+            </w:r>
+            <w:r>
+              <w:t>days_needed // 2</w:t>
+            </w:r>
             <w:r>
               <w:rPr>
                 <w:lang w:val="en-US"/>
@@ -955,6 +1108,7 @@
       <w:pPr>
         <w:rPr>
           <w:rFonts w:ascii="Times New Roman" w:hAnsi="Times New Roman" w:cs="Times New Roman"/>
+          <w:lang w:val="en-US"/>
         </w:rPr>
       </w:pPr>
     </w:p>

</xml_diff>